<commit_message>
fix(citas/F3): cierra el drift sistemico E-050->E-150 (Plan de Adecuacion) en 6 entregables
Completa la correccion de F2.1 (E-012/E-003): "Plan de Adecuacion (E-050)" era
INCORRECTO en E-041/E-042/E-043/E-090/E-614/E-615 (E-050 = Informe de Auditoria
Interna del SGSI; el Plan de Adecuacion es E-150). Sweep + recompila los 6 .docx
(gfm-smart). Tests de render de gobierno actualizados al valor correcto. El E-050
del informe de auditoria (m09, template_registry) queda intacto (no es el Plan).

Verificado: 878 m06+m09 PASS, ruff OK.

Co-Authored-By: Claude Opus 4.8 (1M context) <noreply@anthropic.com>
</commit_message>
<xml_diff>
--- a/var/templates_docx/E-041.docx
+++ b/var/templates_docx/E-041.docx
@@ -699,7 +699,7 @@
           <w:bCs/>
           <w:b/>
         </w:rPr>
-        <w:t xml:space="preserve">implantadas conforme al Plan de Adecuación (E-050)</w:t>
+        <w:t xml:space="preserve">implantadas conforme al Plan de Adecuación (E-150)</w:t>
       </w:r>
       <w:r>
         <w:t xml:space="preserve"> </w:t>
@@ -973,7 +973,7 @@
         <w:t xml:space="preserve"> </w:t>
       </w:r>
       <w:r>
-        <w:t xml:space="preserve">Plan de Adecuación (E-050).</w:t>
+        <w:t xml:space="preserve">Plan de Adecuación (E-150).</w:t>
       </w:r>
     </w:p>
     <w:p>
@@ -1096,7 +1096,10 @@
     </w:p>
     <w:bookmarkEnd w:id="27"/>
     <w:bookmarkEnd w:id="28"/>
-    <w:sectPr/>
+    <w:sectPr>
+      <w:headerReference w:type="default" r:id="rId9"/>
+      <w:footerReference w:type="default" r:id="rId10"/>
+    </w:sectPr>
   </w:body>
 </w:document>
 </file>
@@ -1105,6 +1108,115 @@
 <w:comments xmlns:w="http://schemas.openxmlformats.org/wordprocessingml/2006/main" xmlns:m="http://schemas.openxmlformats.org/officeDocument/2006/math" xmlns:r="http://schemas.openxmlformats.org/officeDocument/2006/relationships" xmlns:o="urn:schemas-microsoft-com:office:office" xmlns:v="urn:schemas-microsoft-com:vml" xmlns:w10="urn:schemas-microsoft-com:office:word" xmlns:a="http://schemas.openxmlformats.org/drawingml/2006/main" xmlns:pic="http://schemas.openxmlformats.org/drawingml/2006/picture" xmlns:wp="http://schemas.openxmlformats.org/drawingml/2006/wordprocessingDrawing"/>
 </file>
 
+<file path=word/footer1.xml><?xml version="1.0" encoding="utf-8"?>
+<w:ftr xmlns:m="http://schemas.openxmlformats.org/officeDocument/2006/math" xmlns:mc="http://schemas.openxmlformats.org/markup-compatibility/2006" xmlns:mo="http://schemas.microsoft.com/office/mac/office/2008/main" xmlns:mv="urn:schemas-microsoft-com:mac:vml" xmlns:o="urn:schemas-microsoft-com:office:office" xmlns:r="http://schemas.openxmlformats.org/officeDocument/2006/relationships" xmlns:v="urn:schemas-microsoft-com:vml" xmlns:w10="urn:schemas-microsoft-com:office:word" xmlns:w14="http://schemas.microsoft.com/office/word/2010/wordml" xmlns:w="http://schemas.openxmlformats.org/wordprocessingml/2006/main" xmlns:wne="http://schemas.microsoft.com/office/word/2006/wordml" xmlns:wp14="http://schemas.microsoft.com/office/word/2010/wordprocessingDrawing" xmlns:wp="http://schemas.openxmlformats.org/drawingml/2006/wordprocessingDrawing" xmlns:wpc="http://schemas.microsoft.com/office/word/2010/wordprocessingCanvas" xmlns:wpg="http://schemas.microsoft.com/office/word/2010/wordprocessingGroup" xmlns:wpi="http://schemas.microsoft.com/office/word/2010/wordprocessingInk" xmlns:wps="http://schemas.microsoft.com/office/word/2010/wordprocessingShape" mc:Ignorable="w14 wp14">
+  <w:tbl>
+    <w:tblPr>
+      <w:tblW w:type="auto" w:w="0"/>
+      <w:tblLayout w:type="fixed"/>
+      <w:tblLook w:firstColumn="1" w:firstRow="1" w:lastColumn="0" w:lastRow="0" w:noHBand="0" w:noVBand="1" w:val="04A0"/>
+    </w:tblPr>
+    <w:tblGrid>
+      <w:gridCol w:w="3024"/>
+      <w:gridCol w:w="3024"/>
+      <w:gridCol w:w="3024"/>
+    </w:tblGrid>
+    <w:tr>
+      <w:tc>
+        <w:tcPr>
+          <w:tcW w:type="dxa" w:w="3810"/>
+        </w:tcPr>
+        <w:p>
+          <w:pPr>
+            <w:jc w:val="left"/>
+          </w:pPr>
+          <w:r>
+            <w:rPr>
+              <w:b w:val="0"/>
+              <w:color w:val="6B7280"/>
+              <w:sz w:val="16"/>
+            </w:rPr>
+            <w:t>CONFIDENCIAL — {{ cliente.razon_social }}</w:t>
+          </w:r>
+        </w:p>
+      </w:tc>
+      <w:tc>
+        <w:tcPr>
+          <w:tcW w:type="dxa" w:w="2540"/>
+        </w:tcPr>
+        <w:p>
+          <w:pPr>
+            <w:jc w:val="center"/>
+          </w:pPr>
+          <w:r>
+            <w:rPr>
+              <w:b w:val="0"/>
+              <w:color w:val="6B7280"/>
+              <w:sz w:val="16"/>
+            </w:rPr>
+            <w:t>E-041 · v{{ proyecto.version_actual }}</w:t>
+          </w:r>
+        </w:p>
+      </w:tc>
+      <w:tc>
+        <w:tcPr>
+          <w:tcW w:type="dxa" w:w="2721"/>
+        </w:tcPr>
+        <w:p>
+          <w:pPr>
+            <w:jc w:val="right"/>
+          </w:pPr>
+          <w:r>
+            <w:rPr>
+              <w:b w:val="0"/>
+              <w:color w:val="6B7280"/>
+              <w:sz w:val="16"/>
+            </w:rPr>
+            <w:t xml:space="preserve">Página </w:t>
+          </w:r>
+          <w:r>
+            <w:rPr>
+              <w:b w:val="0"/>
+              <w:color w:val="6B7280"/>
+              <w:sz w:val="16"/>
+            </w:rPr>
+            <w:fldChar w:fldCharType="begin"/>
+            <w:instrText xml:space="preserve">PAGE</w:instrText>
+            <w:fldChar w:fldCharType="end"/>
+          </w:r>
+          <w:r>
+            <w:rPr>
+              <w:b w:val="0"/>
+              <w:color w:val="6B7280"/>
+              <w:sz w:val="16"/>
+            </w:rPr>
+            <w:t xml:space="preserve"> / </w:t>
+          </w:r>
+          <w:r>
+            <w:rPr>
+              <w:b w:val="0"/>
+              <w:color w:val="6B7280"/>
+              <w:sz w:val="16"/>
+            </w:rPr>
+            <w:fldChar w:fldCharType="begin"/>
+            <w:instrText xml:space="preserve">NUMPAGES</w:instrText>
+            <w:fldChar w:fldCharType="end"/>
+          </w:r>
+        </w:p>
+      </w:tc>
+    </w:tr>
+  </w:tbl>
+  <w:p>
+    <w:r>
+      <w:rPr>
+        <w:sz w:val="2"/>
+      </w:rPr>
+      <w:t>&lt;!--FX_FTR_V2--&gt;</w:t>
+    </w:r>
+  </w:p>
+</w:ftr>
+</file>
+
 <file path=word/footnotes.xml><?xml version="1.0" encoding="utf-8"?>
 <w:footnotes xmlns:w="http://schemas.openxmlformats.org/wordprocessingml/2006/main" xmlns:m="http://schemas.openxmlformats.org/officeDocument/2006/math" xmlns:r="http://schemas.openxmlformats.org/officeDocument/2006/relationships" xmlns:o="urn:schemas-microsoft-com:office:office" xmlns:v="urn:schemas-microsoft-com:vml" xmlns:w10="urn:schemas-microsoft-com:office:word" xmlns:a="http://schemas.openxmlformats.org/drawingml/2006/main" xmlns:pic="http://schemas.openxmlformats.org/drawingml/2006/picture" xmlns:wp="http://schemas.openxmlformats.org/drawingml/2006/wordprocessingDrawing">
   <w:footnote w:type="continuationSeparator" w:id="0">
@@ -1122,6 +1234,90 @@
     </w:p>
   </w:footnote>
 </w:footnotes>
+</file>
+
+<file path=word/header1.xml><?xml version="1.0" encoding="utf-8"?>
+<w:hdr xmlns:m="http://schemas.openxmlformats.org/officeDocument/2006/math" xmlns:mc="http://schemas.openxmlformats.org/markup-compatibility/2006" xmlns:mo="http://schemas.microsoft.com/office/mac/office/2008/main" xmlns:mv="urn:schemas-microsoft-com:mac:vml" xmlns:o="urn:schemas-microsoft-com:office:office" xmlns:r="http://schemas.openxmlformats.org/officeDocument/2006/relationships" xmlns:v="urn:schemas-microsoft-com:vml" xmlns:w10="urn:schemas-microsoft-com:office:word" xmlns:w14="http://schemas.microsoft.com/office/word/2010/wordml" xmlns:w="http://schemas.openxmlformats.org/wordprocessingml/2006/main" xmlns:wne="http://schemas.microsoft.com/office/word/2006/wordml" xmlns:wp14="http://schemas.microsoft.com/office/word/2010/wordprocessingDrawing" xmlns:wp="http://schemas.openxmlformats.org/drawingml/2006/wordprocessingDrawing" xmlns:wpc="http://schemas.microsoft.com/office/word/2010/wordprocessingCanvas" xmlns:wpg="http://schemas.microsoft.com/office/word/2010/wordprocessingGroup" xmlns:wpi="http://schemas.microsoft.com/office/word/2010/wordprocessingInk" xmlns:wps="http://schemas.microsoft.com/office/word/2010/wordprocessingShape" mc:Ignorable="w14 wp14">
+  <w:tbl>
+    <w:tblPr>
+      <w:tblW w:type="auto" w:w="0"/>
+      <w:jc w:val="center"/>
+      <w:tblLayout w:type="fixed"/>
+      <w:tblLook w:firstColumn="1" w:firstRow="1" w:lastColumn="0" w:lastRow="0" w:noHBand="0" w:noVBand="1" w:val="04A0"/>
+    </w:tblPr>
+    <w:tblGrid>
+      <w:gridCol w:w="3024"/>
+      <w:gridCol w:w="3024"/>
+      <w:gridCol w:w="3024"/>
+    </w:tblGrid>
+    <w:tr>
+      <w:tc>
+        <w:tcPr>
+          <w:tcW w:type="dxa" w:w="3447"/>
+        </w:tcPr>
+        <w:p>
+          <w:pPr>
+            <w:jc w:val="left"/>
+          </w:pPr>
+          <w:r>
+            <w:rPr>
+              <w:b/>
+              <w:color w:val="0B1F3A"/>
+              <w:sz w:val="22"/>
+            </w:rPr>
+            <w:t>{{ cliente.header_brand }}</w:t>
+          </w:r>
+        </w:p>
+      </w:tc>
+      <w:tc>
+        <w:tcPr>
+          <w:tcW w:type="dxa" w:w="3084"/>
+        </w:tcPr>
+        <w:p>
+          <w:pPr>
+            <w:jc w:val="center"/>
+          </w:pPr>
+          <w:r>
+            <w:rPr>
+              <w:b w:val="0"/>
+              <w:color w:val="6B7280"/>
+              <w:sz w:val="18"/>
+            </w:rPr>
+            <w:t>E-041 · Documento E-041</w:t>
+            <w:br/>
+            <w:t>versión {{ proyecto.version_actual }}</w:t>
+          </w:r>
+        </w:p>
+      </w:tc>
+      <w:tc>
+        <w:tcPr>
+          <w:tcW w:type="dxa" w:w="2540"/>
+        </w:tcPr>
+        <w:p>
+          <w:pPr>
+            <w:jc w:val="right"/>
+          </w:pPr>
+          <w:r>
+            <w:rPr>
+              <w:b w:val="0"/>
+              <w:color w:val="0B1F3A"/>
+              <w:sz w:val="18"/>
+            </w:rPr>
+            <w:t>{{ consultor.header_brand }}</w:t>
+          </w:r>
+        </w:p>
+      </w:tc>
+    </w:tr>
+  </w:tbl>
+  <w:p>
+    <w:r>
+      <w:rPr>
+        <w:sz w:val="2"/>
+      </w:rPr>
+      <w:t>&lt;!--FX_HDR_V2--&gt;</w:t>
+    </w:r>
+  </w:p>
+</w:hdr>
 </file>
 
 <file path=word/numbering.xml><?xml version="1.0" encoding="utf-8"?>

</xml_diff>